<commit_message>
docs: update minimundo with patient self-service and actor changes
</commit_message>
<xml_diff>
--- a/docs/minimundo/minimundo (versao principal).docx
+++ b/docs/minimundo/minimundo (versao principal).docx
@@ -15,386 +15,364 @@
         <w:br/>
       </w:r>
       <w:r>
-        <w:t xml:space="preserve"> A clínica</w:t>
-      </w:r>
-      <w:r>
-        <w:t xml:space="preserve"> médica</w:t>
+        <w:t xml:space="preserve"> A clínica médica </w:t>
+      </w:r>
+      <w:proofErr w:type="spellStart"/>
+      <w:r>
+        <w:t>Areas</w:t>
+      </w:r>
+      <w:proofErr w:type="spellEnd"/>
+      <w:r>
+        <w:t xml:space="preserve"> Health está expandindo a sua atuação </w:t>
+      </w:r>
+      <w:r>
+        <w:t xml:space="preserve">no Sudeste do Brasil, e solicitou a empresa JKLE o </w:t>
+      </w:r>
+      <w:r>
+        <w:t>desenvolvimento de um software para controlar os agendamentos e a realização das consultas.</w:t>
+      </w:r>
+      <w:r>
+        <w:t xml:space="preserve"> A </w:t>
+      </w:r>
+      <w:r>
+        <w:t>clínica atende a várias especialidades (</w:t>
+      </w:r>
+      <w:r>
+        <w:t>cardiologia, ortopedia, pediatria</w:t>
+      </w:r>
+      <w:r>
+        <w:t>, entre outras</w:t>
+      </w:r>
+      <w:r>
+        <w:t>).</w:t>
+      </w:r>
+      <w:r>
+        <w:t xml:space="preserve"> Para suportar esse crescimento operacional, o sistema de gestão clínica será organizado em domínios independentes, seguindo uma arquitetura baseada em microsserviços</w:t>
+      </w:r>
+      <w:r>
+        <w:t>.</w:t>
+      </w:r>
+    </w:p>
+    <w:p>
+      <w:r>
+        <w:t xml:space="preserve">O domínio Cadastro e Gestão Administrativa será responsável pelo gerenciamento dos cadastros da clínica, </w:t>
+      </w:r>
+      <w:r>
+        <w:t>incluindo</w:t>
+      </w:r>
+      <w:r>
+        <w:t>: especialidades; consultórios; médicos; pacientes; medicamentos; exames.</w:t>
+      </w:r>
+    </w:p>
+    <w:p>
+      <w:r>
+        <w:t>O domínio Agendamento Clínico será responsável pelo gerenciamento operacional das consultas, incluindo: escalas médicas; disponibilidade de horários; agendamento; remarcação; cancelamento; realização das consultas.</w:t>
+      </w:r>
+    </w:p>
+    <w:p>
+      <w:r>
+        <w:t>O domínio Faturamento e Cobrança será responsável pela gestão financeira das consultas, incluindo: definição dos valores vigentes; registro de pagamentos; emissão e acompanhamento das cobranças.</w:t>
+      </w:r>
+    </w:p>
+    <w:p>
+      <w:r>
+        <w:t>Os domínios deverão disponibilizar operações de gerenciamento (CRUD) compatíveis com suas responsabilidades, incluindo criação, consulta, atualização e gerenciamento das entidades do sistema, tais como pacientes, médicos, especialidades, consultórios, escalas de atendimento, consultas e registros financeiros.</w:t>
+      </w:r>
+    </w:p>
+    <w:p>
+      <w:r>
+        <w:t>O sistema deverá possuir controle de acesso baseado em perfis de usuário, restringindo funcionalidades de acordo com os papéis de diretor, gerente, médico, atendente e paciente.</w:t>
       </w:r>
       <w:r>
         <w:t xml:space="preserve"> </w:t>
       </w:r>
-      <w:proofErr w:type="spellStart"/>
-      <w:r>
-        <w:t>Areas</w:t>
-      </w:r>
-      <w:proofErr w:type="spellEnd"/>
-      <w:r>
-        <w:t xml:space="preserve"> Health</w:t>
-      </w:r>
-      <w:r>
-        <w:t xml:space="preserve"> está expandindo a sua atuação </w:t>
-      </w:r>
-      <w:r>
-        <w:t xml:space="preserve">no Sudeste do Brasil, e solicitou a empresa JKLE o </w:t>
-      </w:r>
-      <w:r>
-        <w:t>desenvolvimento de um software para controlar os agendamentos e a realização das consultas.</w:t>
-      </w:r>
-      <w:r>
-        <w:t xml:space="preserve"> A </w:t>
-      </w:r>
-      <w:r>
-        <w:t>clínica atende a várias especialidades (</w:t>
-      </w:r>
-      <w:r>
-        <w:t>cardiologia, ortopedia, pediatria</w:t>
-      </w:r>
-      <w:r>
-        <w:t>, entre outras</w:t>
-      </w:r>
-      <w:r>
-        <w:t>).</w:t>
+    </w:p>
+    <w:p>
+      <w:r>
+        <w:t>O atendente continuará responsável pelas operações administrativas internas da clínica, podendo auxiliar pacientes presencialmente, realizar cadastros, atualizar informações cadastrais, registrar pagamentos e prestar suporte operacional às funcionalidades do sistema.</w:t>
+      </w:r>
+    </w:p>
+    <w:p>
+      <w:r>
+        <w:t>Cada domínio será implementado como um microsserviço independente, possuindo responsabilidade própria sobre seus dados, regras de negócio e funcionalidades. Cada microsserviço será responsável pelo gerenciamento de suas próprias informações, evitando compartilhamento direto de banco de dados entre os domínios.</w:t>
+      </w:r>
+    </w:p>
+    <w:p>
+      <w:r>
+        <w:t>A comunicação entre os microsserviços ocorrerá por meio de APIs REST utilizando mensagens em formato JSON, preservando o desacoplamento entre os domínios do sistema</w:t>
+      </w:r>
+      <w:r>
+        <w:t>.</w:t>
+      </w:r>
+    </w:p>
+    <w:p>
+      <w:r>
+        <w:t>A arquitetura deverá garantir tolerância a falhas, permitindo que a indisponibilidade temporária de um microsserviço não interrompa completamente o funcionamento do sistema. Por exemplo, falhas momentâneas no domínio de faturamento não deverão impedir o registro ou agendamento das consultas</w:t>
+      </w:r>
+      <w:r>
+        <w:t>.</w:t>
+      </w:r>
+    </w:p>
+    <w:p>
+      <w:r>
+        <w:t xml:space="preserve">Para a execução de determinadas funcionalidades, poderá haver comunicação entre os domínios do sistema. Por exemplo, durante o processo de agendamento, o domínio de </w:t>
+      </w:r>
+      <w:r>
+        <w:lastRenderedPageBreak/>
+        <w:t>Agendamento Clínico poderá consultar informações do domínio Cadastro e Gestão Administrativa para validar pacientes, médicos e especialidades disponíveis, bem como interagir com o domínio de Faturamento e Cobrança para obtenção do valor vigente da consulta</w:t>
+      </w:r>
+      <w:r>
+        <w:t>.</w:t>
+      </w:r>
+    </w:p>
+    <w:p/>
+    <w:p>
+      <w:r>
+        <w:t xml:space="preserve"> É necessário que o diretor mantenha esse</w:t>
       </w:r>
       <w:r>
         <w:t xml:space="preserve"> </w:t>
       </w:r>
       <w:r>
-        <w:t>Para suportar esse crescimento operacional, o sistema de gestão clínica será organizado em domínios independentes, seguindo uma arquitetura baseada em microsserviços</w:t>
-      </w:r>
-      <w:r>
-        <w:t>.</w:t>
-      </w:r>
-    </w:p>
-    <w:p>
-      <w:r>
-        <w:t xml:space="preserve">O domínio Cadastro e Gestão Administrativa será responsável pelo gerenciamento dos cadastros da clínica, </w:t>
-      </w:r>
-      <w:r>
-        <w:t>incluindo</w:t>
-      </w:r>
-      <w:r>
-        <w:t>: especialidades; consultórios; médicos; pacientes; medicamentos; exames.</w:t>
-      </w:r>
-    </w:p>
-    <w:p>
-      <w:r>
-        <w:t>O domínio Agendamento Clínico será responsável pelo gerenciamento operacional das consultas, incluindo: escalas médicas; disponibilidade de horários; agendamento; remarcação; cancelamento; realização das consultas.</w:t>
-      </w:r>
-    </w:p>
-    <w:p>
-      <w:r>
-        <w:t>O domínio Faturamento e Cobrança será responsável pela gestão financeira das consultas, incluindo: definição dos valores vigentes; registro de pagamentos; emissão e acompanhamento das cobranças.</w:t>
-      </w:r>
-    </w:p>
-    <w:p>
-      <w:r>
-        <w:t>Os domínios deverão disponibilizar operações de gerenciamento (CRUD) compatíveis com suas responsabilidades, incluindo criação, consulta, atualização e gerenciamento das entidades do sistema, tais como pacientes, médicos, especialidades, consultórios, escalas de atendimento, consultas e registros financeiros.</w:t>
-      </w:r>
-    </w:p>
-    <w:p>
-      <w:r>
-        <w:t>O sistema deverá possuir controle de acesso baseado em perfis de usuário, restringindo funcionalidades de acordo com os papéis de diretor, gerente, médico</w:t>
+        <w:t xml:space="preserve">cadastro atualizado. Das especialidades é </w:t>
+      </w:r>
+      <w:r>
+        <w:t>necessário se</w:t>
+      </w:r>
+      <w:r>
+        <w:t xml:space="preserve"> conhecer nome e descrição.</w:t>
+      </w:r>
+    </w:p>
+    <w:p>
+      <w:r>
+        <w:t>O cadastro dos consultórios é mantido pelo diretor. De cada consultório, deve-se conhecer o número</w:t>
+      </w:r>
+      <w:r>
+        <w:t>, bloco</w:t>
+      </w:r>
+      <w:r>
+        <w:t xml:space="preserve"> e o tamanho.</w:t>
+      </w:r>
+    </w:p>
+    <w:p>
+      <w:r>
+        <w:t>O cadastro dos médicos que trabalham na clínica é mantido pelo gerente. Dos médicos é preciso conhecer: nome,</w:t>
+      </w:r>
+      <w:r>
+        <w:t xml:space="preserve"> </w:t>
+      </w:r>
+      <w:r>
+        <w:t xml:space="preserve">CPF, CRM, data de nascimento, endereço, telefones e e-mails e as especialidades a que ele atende. </w:t>
+      </w:r>
+    </w:p>
+    <w:p>
+      <w:r>
+        <w:t>Um médico</w:t>
+      </w:r>
+      <w:r>
+        <w:t xml:space="preserve"> </w:t>
+      </w:r>
+      <w:r>
+        <w:t>deve ser especializado em, pelo menos, uma das especialidades oferecidas pela clínica.</w:t>
+      </w:r>
+    </w:p>
+    <w:p>
+      <w:r>
+        <w:t>Além da gestão dos médicos e das escalas, o gerente será responsável por analisar e aprovar ou reprovar solicitações de cancelamento das consultas.</w:t>
+      </w:r>
+    </w:p>
+    <w:p>
+      <w:r>
+        <w:t xml:space="preserve">No domínio de agendamento </w:t>
+      </w:r>
+      <w:r>
+        <w:t>C</w:t>
+      </w:r>
+      <w:r>
+        <w:t>línico, o gerente deve atualizar</w:t>
+      </w:r>
+      <w:r>
+        <w:t>, sempre que necessário, a escala de trabalho de cada médico,</w:t>
+      </w:r>
+      <w:r>
+        <w:t xml:space="preserve"> </w:t>
+      </w:r>
+      <w:r>
+        <w:t>contendo: data de início da vigência, data de término da vigência (quando ocorrer), dia da semana, hora inicial e</w:t>
+      </w:r>
+      <w:r>
+        <w:t xml:space="preserve"> </w:t>
+      </w:r>
+      <w:r>
+        <w:t>hora final da escala. Neste momento, o gerente deve identificar qual consultório será utilizado pelo médico durante</w:t>
+      </w:r>
+      <w:r>
+        <w:t xml:space="preserve"> </w:t>
+      </w:r>
+      <w:r>
+        <w:t>cada escala. Não pode haver sobreposição nas escalas estabelecidas para um médico em determinado período,</w:t>
+      </w:r>
+      <w:r>
+        <w:t xml:space="preserve"> </w:t>
+      </w:r>
+      <w:r>
+        <w:t>nem sobreposição nos consultórios definidos para cada escala.</w:t>
+      </w:r>
+    </w:p>
+    <w:p>
+      <w:r>
+        <w:t>No domínio de faturamento, o diretor é responsável por atualizar o valor vigente das consultas</w:t>
+      </w:r>
+      <w:r>
+        <w:t xml:space="preserve">, </w:t>
+      </w:r>
+      <w:r>
+        <w:t>o qual não depende da especialidade</w:t>
+      </w:r>
+      <w:r>
+        <w:t xml:space="preserve"> </w:t>
+      </w:r>
+      <w:r>
+        <w:t>e deverá ter uma data de vigência.</w:t>
+      </w:r>
+    </w:p>
+    <w:p>
+      <w:r>
+        <w:t xml:space="preserve">No domínio de Agendamento </w:t>
+      </w:r>
+      <w:r>
+        <w:t>C</w:t>
+      </w:r>
+      <w:r>
+        <w:t>línico, o paciente poderá solicitar diretamente o agendamento de uma consulta pelo sistema ou realizá-lo por intermédio do atendente. Antes do agendamento, deverá ser verificado se o paciente já possui cadastro ativo. Caso não possua cadastro, o paciente poderá realizar seu próprio cadastro no sistema, ou o atendente poderá efetuá-lo em seu nome durante o atendimento. Tanto o paciente quanto o atendente poderão atualizar as informações cadastrais do paciente sempre que necessário.</w:t>
+      </w:r>
+    </w:p>
+    <w:p>
+      <w:r>
+        <w:t>Dos pacientes é preciso conhecer: nome,</w:t>
+      </w:r>
+      <w:r>
+        <w:t xml:space="preserve"> </w:t>
+      </w:r>
+      <w:r>
+        <w:t xml:space="preserve">CPF, </w:t>
+      </w:r>
+      <w:r>
+        <w:t>g</w:t>
+      </w:r>
+      <w:r>
+        <w:t xml:space="preserve">ênero </w:t>
+      </w:r>
+      <w:r>
+        <w:t>b</w:t>
+      </w:r>
+      <w:r>
+        <w:t>iológico</w:t>
+      </w:r>
+      <w:r>
+        <w:t xml:space="preserve">, </w:t>
+      </w:r>
+      <w:r>
+        <w:t>data de nascimento, endereço, telefones e e-mails.</w:t>
+      </w:r>
+      <w:r>
+        <w:t xml:space="preserve"> </w:t>
+      </w:r>
+      <w:r>
+        <w:t>Em seguida, o paciente poderá selecionar diretamente o médico ou a especialidade desejada por meio do sistema, ou realizar essa operação com auxílio do atendente. Com base nisso, o sistema deverá consultar e apresentar as disponibilidades existentes.</w:t>
+      </w:r>
+    </w:p>
+    <w:p>
+      <w:r>
+        <w:t>Caso exista interesse, a consulta poderá ser agendada identificando a data, horário e o médico responsável, podendo a operação ser realizada diretamente pelo paciente ou pelo atendente.</w:t>
+      </w:r>
+    </w:p>
+    <w:p>
+      <w:r>
+        <w:t>Uma consulta agendada poderá ser reagendada pelo paciente ou pelo atendente, desde que permaneça no estado Agendada.</w:t>
+      </w:r>
+      <w:r>
+        <w:t xml:space="preserve"> </w:t>
+      </w:r>
+      <w:r>
+        <w:t xml:space="preserve">No processo de reagendamento, o sistema deverá </w:t>
+      </w:r>
+      <w:r>
+        <w:lastRenderedPageBreak/>
+        <w:t>consultar novamente as disponibilidades do médico ou da especialidade desejada, registrando a nova data, horário e, quando aplicável, o médico responsável.</w:t>
+      </w:r>
+    </w:p>
+    <w:p>
+      <w:r>
+        <w:t xml:space="preserve">Durante a realização de uma consulta, no domínio de agendamento </w:t>
+      </w:r>
+      <w:r>
+        <w:t>C</w:t>
+      </w:r>
+      <w:r>
+        <w:t>línico</w:t>
+      </w:r>
+      <w:r>
+        <w:t>, além de ser registrada a data e hora inicial, o médico deverá informar uma descrição sobre</w:t>
+      </w:r>
+      <w:r>
+        <w:t xml:space="preserve"> </w:t>
+      </w:r>
+      <w:r>
+        <w:t>o estado geral do paciente, poderá prescrever medicamentos (informando a dose e a posologia), poderá solicitar</w:t>
+      </w:r>
+      <w:r>
+        <w:t xml:space="preserve"> </w:t>
+      </w:r>
+      <w:r>
+        <w:t xml:space="preserve">exames ou poderá registrar o resultado de exames solicitados anteriormente. </w:t>
+      </w:r>
+    </w:p>
+    <w:p>
+      <w:r>
+        <w:t>Ao final da consulta, o médico deve</w:t>
       </w:r>
       <w:r>
         <w:t xml:space="preserve"> e</w:t>
       </w:r>
       <w:r>
-        <w:t xml:space="preserve"> atendente</w:t>
-      </w:r>
-      <w:r>
-        <w:t>.</w:t>
+        <w:t>ncerrá-la, fazendo com que fique registrada a data e a hora do encerramento.</w:t>
+      </w:r>
+    </w:p>
+    <w:p>
+      <w:r>
+        <w:t>No domínio de Cadastro e Gestão Administrativa, os médicos são responsáveis pela manutenção do cadastro de medicamentos e exames.</w:t>
       </w:r>
       <w:r>
         <w:t xml:space="preserve"> </w:t>
       </w:r>
       <w:r>
-        <w:t>As interações dos pacientes com o sistema ocorrerão por intermédio do atendente, responsável pela execução das operações administrativas relacionadas ao paciente.</w:t>
-      </w:r>
-    </w:p>
-    <w:p>
-      <w:r>
-        <w:t>Cada domínio será implementado como um microsserviço independente, possuindo responsabilidade própria sobre seus dados, regras de negócio e funcionalidades. Cada microsserviço será responsável pelo gerenciamento de suas próprias informações, evitando compartilhamento direto de banco de dados entre os domínios.</w:t>
-      </w:r>
-    </w:p>
-    <w:p>
-      <w:r>
-        <w:t>A comunicação entre os microsserviços ocorrerá por meio de APIs REST utilizando mensagens em formato JSON, preservando o desacoplamento entre os domínios do sistema</w:t>
-      </w:r>
-      <w:r>
-        <w:t>.</w:t>
-      </w:r>
-    </w:p>
-    <w:p>
-      <w:r>
-        <w:t>A arquitetura deverá garantir tolerância a falhas, permitindo que a indisponibilidade temporária de um microsserviço não interrompa completamente o funcionamento do sistema. Por exemplo, falhas momentâneas no domínio de faturamento não deverão impedir o registro ou agendamento das consultas</w:t>
-      </w:r>
-      <w:r>
-        <w:t>.</w:t>
-      </w:r>
-    </w:p>
-    <w:p>
-      <w:r>
-        <w:t xml:space="preserve">Para a execução de determinadas funcionalidades, poderá haver comunicação entre os domínios do sistema. Por exemplo, durante o processo de agendamento, o domínio de Agendamento Clínico poderá consultar informações do domínio Cadastro e Gestão Administrativa para validar pacientes, médicos e especialidades disponíveis, bem como </w:t>
-      </w:r>
-      <w:r>
-        <w:lastRenderedPageBreak/>
-        <w:t>interagir com o domínio de Faturamento e Cobrança para obtenção do valor vigente da consulta</w:t>
-      </w:r>
-      <w:r>
-        <w:t>.</w:t>
-      </w:r>
-    </w:p>
-    <w:p/>
-    <w:p>
-      <w:r>
-        <w:t xml:space="preserve"> É necessário que o diretor mantenha esse</w:t>
+        <w:t>Tanto dos medicamentos,</w:t>
       </w:r>
       <w:r>
         <w:t xml:space="preserve"> </w:t>
       </w:r>
       <w:r>
-        <w:t xml:space="preserve">cadastro atualizado. Das especialidades é </w:t>
-      </w:r>
-      <w:r>
-        <w:t>necessário se</w:t>
-      </w:r>
-      <w:r>
-        <w:t xml:space="preserve"> conhecer nome e descrição.</w:t>
-      </w:r>
-    </w:p>
-    <w:p>
-      <w:r>
-        <w:t>O cadastro dos consultórios é mantido pelo diretor. De cada consultório, deve-se conhecer o número</w:t>
-      </w:r>
-      <w:r>
-        <w:t>, bloco</w:t>
-      </w:r>
-      <w:r>
-        <w:t xml:space="preserve"> e o tamanho.</w:t>
-      </w:r>
-    </w:p>
-    <w:p>
-      <w:r>
-        <w:t>O cadastro dos médicos que trabalham na clínica é mantido pelo gerente. Dos médicos é preciso conhecer: nome,</w:t>
+        <w:t>quanto dos exames, deve-se conhecer o nome e a indicação.</w:t>
+      </w:r>
+    </w:p>
+    <w:p>
+      <w:r>
+        <w:t>O domínio de Faturamento e Cobrança será responsável pelo registro dos pagamentos associados às consultas, utilizando o valor vigente correspondente à data do agendamento. O pagamento poderá ocorrer conforme as políticas operacionais da clínica.</w:t>
+      </w:r>
+    </w:p>
+    <w:p>
+      <w:r>
+        <w:t xml:space="preserve">Uma consulta poderá assumir os estados Agendada, Em Andamento, Finalizada ou Cancelada. </w:t>
+      </w:r>
+      <w:r>
+        <w:t>Enquanto estiver no estado Agendada, o paciente ou o atendente poderão registrar solicitações de reagendamento ou cancelamento, desde que o horário previsto ainda não tenha sido ultrapassado.</w:t>
       </w:r>
       <w:r>
         <w:t xml:space="preserve"> </w:t>
       </w:r>
       <w:r>
-        <w:t xml:space="preserve">CPF, CRM, data de nascimento, endereço, telefones e e-mails e as especialidades a que ele atende. </w:t>
-      </w:r>
-    </w:p>
-    <w:p>
-      <w:r>
-        <w:t>Um médico</w:t>
-      </w:r>
-      <w:r>
-        <w:t xml:space="preserve"> </w:t>
-      </w:r>
-      <w:r>
-        <w:t>deve ser especializado em, pelo menos, uma das especialidades oferecidas pela clínica.</w:t>
-      </w:r>
-    </w:p>
-    <w:p>
-      <w:r>
-        <w:t>Além da gestão dos médicos e das escalas, o gerente será responsável por analisar e aprovar ou reprovar solicitações de cancelamento das consultas.</w:t>
-      </w:r>
-    </w:p>
-    <w:p>
-      <w:r>
-        <w:t>No domínio de agendamento clínico, o gerente deve atualizar</w:t>
-      </w:r>
-      <w:r>
-        <w:t>, sempre que necessário, a escala de trabalho de cada médico,</w:t>
-      </w:r>
-      <w:r>
-        <w:t xml:space="preserve"> </w:t>
-      </w:r>
-      <w:r>
-        <w:t>contendo: data de início da vigência, data de término da vigência (quando ocorrer), dia da semana, hora inicial e</w:t>
-      </w:r>
-      <w:r>
-        <w:t xml:space="preserve"> </w:t>
-      </w:r>
-      <w:r>
-        <w:t>hora final da escala. Neste momento, o gerente deve identificar qual consultório será utilizado pelo médico durante</w:t>
-      </w:r>
-      <w:r>
-        <w:t xml:space="preserve"> </w:t>
-      </w:r>
-      <w:r>
-        <w:t>cada escala. Não pode haver sobreposição nas escalas estabelecidas para um médico em determinado período,</w:t>
-      </w:r>
-      <w:r>
-        <w:t xml:space="preserve"> </w:t>
-      </w:r>
-      <w:r>
-        <w:t>nem sobreposição nos consultórios definidos para cada escala.</w:t>
-      </w:r>
-    </w:p>
-    <w:p>
-      <w:r>
-        <w:t>No domínio de faturamento, o diretor é responsável por atualizar o valor vigente das consultas</w:t>
-      </w:r>
-      <w:r>
-        <w:t xml:space="preserve">, </w:t>
-      </w:r>
-      <w:r>
-        <w:t>o qual não depende da especialidade</w:t>
-      </w:r>
-      <w:r>
-        <w:t xml:space="preserve"> </w:t>
-      </w:r>
-      <w:r>
-        <w:t>e deverá ter uma data de vigência.</w:t>
-      </w:r>
-    </w:p>
-    <w:p>
-      <w:r>
-        <w:t>No domínio de agendamento clínico, quando o paciente solicita ao atendente o agendamento de uma consulta</w:t>
-      </w:r>
-      <w:r>
-        <w:t xml:space="preserve">, o atendente deve verificar se o </w:t>
-      </w:r>
-      <w:r>
-        <w:t>paciente</w:t>
-      </w:r>
-      <w:r>
-        <w:t xml:space="preserve"> já está</w:t>
-      </w:r>
-      <w:r>
-        <w:t xml:space="preserve"> </w:t>
-      </w:r>
-      <w:r>
-        <w:t xml:space="preserve">cadastrado. </w:t>
-      </w:r>
-      <w:r>
-        <w:t>Caso o paciente não possua cadastro, o atendente deverá realizá-lo. O atendente também poderá atualizar informações cadastrais do paciente sempre que solicitado</w:t>
-      </w:r>
-      <w:r>
-        <w:t xml:space="preserve">. </w:t>
-      </w:r>
-    </w:p>
-    <w:p>
-      <w:r>
-        <w:t>Dos pacientes é preciso conhecer: nome,</w:t>
-      </w:r>
-      <w:r>
-        <w:t xml:space="preserve"> </w:t>
-      </w:r>
-      <w:r>
-        <w:t xml:space="preserve">CPF, </w:t>
-      </w:r>
-      <w:r>
-        <w:t>g</w:t>
-      </w:r>
-      <w:r>
-        <w:t xml:space="preserve">ênero </w:t>
-      </w:r>
-      <w:r>
-        <w:t>b</w:t>
-      </w:r>
-      <w:r>
-        <w:t>iológico</w:t>
-      </w:r>
-      <w:r>
-        <w:t xml:space="preserve">, </w:t>
-      </w:r>
-      <w:r>
-        <w:t>data de nascimento, endereço, telefones e e-mails.</w:t>
-      </w:r>
-      <w:r>
-        <w:t xml:space="preserve"> </w:t>
-      </w:r>
-      <w:r>
-        <w:t>Em seguida, o atendente solicita ao paciente o médico ou a especialidade que o paciente deseja. Com base nisso,</w:t>
-      </w:r>
-      <w:r>
-        <w:t xml:space="preserve"> </w:t>
-      </w:r>
-      <w:r>
-        <w:t xml:space="preserve">o atendente consulta as disponibilidades e passa a informação para o paciente. </w:t>
-      </w:r>
-    </w:p>
-    <w:p>
-      <w:r>
-        <w:t>Caso o paciente tenha interesse, a</w:t>
-      </w:r>
-      <w:r>
-        <w:t xml:space="preserve"> </w:t>
-      </w:r>
-      <w:r>
-        <w:t>consulta é agendada identificando a data, hora e o médico.</w:t>
-      </w:r>
-    </w:p>
-    <w:p>
-      <w:r>
-        <w:t>Uma consulta agendada poderá ser reagendada pelo atendente mediante solicitação do paciente, desde que permaneça no estado Agendada.</w:t>
-      </w:r>
-      <w:r>
-        <w:t xml:space="preserve"> No processo de reagendamento, o sistema deverá consultar novamente as disponibilidades do médico ou da especialidade desejada, registrando a nova data, horário e, quando aplicável, o médico responsável.</w:t>
-      </w:r>
-    </w:p>
-    <w:p>
-      <w:r>
-        <w:t>Durante a realização de uma consulta, no domínio de agendamento clínico</w:t>
-      </w:r>
-      <w:r>
-        <w:t>, além de ser registrada a data e hora inicial, o médico deverá informar uma descrição sobre</w:t>
-      </w:r>
-      <w:r>
-        <w:t xml:space="preserve"> </w:t>
-      </w:r>
-      <w:r>
-        <w:t xml:space="preserve">o estado geral do paciente, poderá prescrever medicamentos (informando a dose e a posologia), </w:t>
-      </w:r>
-      <w:r>
-        <w:lastRenderedPageBreak/>
-        <w:t>poderá solicitar</w:t>
-      </w:r>
-      <w:r>
-        <w:t xml:space="preserve"> </w:t>
-      </w:r>
-      <w:r>
-        <w:t xml:space="preserve">exames ou poderá registrar o resultado de exames solicitados anteriormente. </w:t>
-      </w:r>
-    </w:p>
-    <w:p>
-      <w:r>
-        <w:t>Ao final da consulta, o médico deve</w:t>
-      </w:r>
-      <w:r>
-        <w:t xml:space="preserve"> e</w:t>
-      </w:r>
-      <w:r>
-        <w:t>ncerrá-la, fazendo com que fique registrada a data e a hora do encerramento.</w:t>
-      </w:r>
-    </w:p>
-    <w:p>
-      <w:r>
-        <w:t>No domínio de Cadastro e Gestão Administrativa, os médicos são responsáveis pela manutenção do cadastro de medicamentos e exames.</w:t>
-      </w:r>
-      <w:r>
-        <w:t xml:space="preserve"> </w:t>
-      </w:r>
-      <w:r>
-        <w:t>Tanto dos medicamentos,</w:t>
-      </w:r>
-      <w:r>
-        <w:t xml:space="preserve"> </w:t>
-      </w:r>
-      <w:r>
-        <w:t>quanto dos exames, deve-se conhecer o nome e a indicação.</w:t>
-      </w:r>
-    </w:p>
-    <w:p>
-      <w:r>
-        <w:t>O domínio de Faturamento e Cobrança será responsável pelo registro dos pagamentos associados às consultas, utilizando o valor vigente correspondente à data do agendamento. O pagamento poderá ocorrer conforme as políticas operacionais da clínica.</w:t>
-      </w:r>
-    </w:p>
-    <w:p>
-      <w:r>
-        <w:t>Uma consulta poderá assumir os estados Agendada, Em Andamento, Finalizada ou Cancelada. Enquanto estiver no estado Agendada, o atendente poderá registrar solicitações de reagendamento ou cancelamento em nome do paciente, desde que o horário previsto ainda não tenha sido ultrapassado. As solicitações de cancelamento deverão ser analisadas pelo gerente, que poderá aprová-las ou rejeitá-las.</w:t>
+        <w:t>As solicitações de cancelamento deverão ser analisadas pelo gerente, que poderá aprová-las ou rejeitá-las.</w:t>
       </w:r>
     </w:p>
     <w:sectPr>

</xml_diff>